<commit_message>
debut de correction de la grande faille de sécurité dans le back
</commit_message>
<xml_diff>
--- a/Tutoriel  et Documentations/Documentation technique/documentation_technique_code_backend.docx
+++ b/Tutoriel  et Documentations/Documentation technique/documentation_technique_code_backend.docx
@@ -786,21 +786,19 @@
         <w:rPr>
           <w:rFonts w:ascii="Calibri" w:hAnsi="Calibri" w:cs="Calibri"/>
         </w:rPr>
-        <w:t xml:space="preserve">il </w:t>
-      </w:r>
-      <w:proofErr w:type="spellStart"/>
-      <w:r>
-        <w:rPr>
-          <w:rFonts w:ascii="Calibri" w:hAnsi="Calibri" w:cs="Calibri"/>
-        </w:rPr>
-        <w:t>ya</w:t>
-      </w:r>
-      <w:proofErr w:type="spellEnd"/>
-      <w:r>
-        <w:rPr>
-          <w:rFonts w:ascii="Calibri" w:hAnsi="Calibri" w:cs="Calibri"/>
-        </w:rPr>
-        <w:t xml:space="preserve"> aussi en plus le </w:t>
+        <w:t>il y</w:t>
+      </w:r>
+      <w:r>
+        <w:rPr>
+          <w:rFonts w:ascii="Calibri" w:hAnsi="Calibri" w:cs="Calibri"/>
+        </w:rPr>
+        <w:t xml:space="preserve"> </w:t>
+      </w:r>
+      <w:r>
+        <w:rPr>
+          <w:rFonts w:ascii="Calibri" w:hAnsi="Calibri" w:cs="Calibri"/>
+        </w:rPr>
+        <w:t xml:space="preserve">a aussi en plus le </w:t>
       </w:r>
       <w:proofErr w:type="spellStart"/>
       <w:r>
@@ -864,16 +862,14 @@
         </w:rPr>
         <w:t xml:space="preserve">Le dossier </w:t>
       </w:r>
-      <w:proofErr w:type="spellStart"/>
-      <w:r>
-        <w:rPr>
-          <w:rFonts w:ascii="Calibri" w:hAnsi="Calibri" w:cs="Calibri"/>
-          <w:b/>
-          <w:bCs/>
-        </w:rPr>
-        <w:t>repositort</w:t>
-      </w:r>
-      <w:proofErr w:type="spellEnd"/>
+      <w:r>
+        <w:rPr>
+          <w:rFonts w:ascii="Calibri" w:hAnsi="Calibri" w:cs="Calibri"/>
+          <w:b/>
+          <w:bCs/>
+        </w:rPr>
+        <w:t>repository</w:t>
+      </w:r>
       <w:r>
         <w:rPr>
           <w:rFonts w:ascii="Calibri" w:hAnsi="Calibri" w:cs="Calibri"/>
@@ -2187,7 +2183,6 @@
         <w:docPartUnique/>
       </w:docPartObj>
     </w:sdtPr>
-    <w:sdtEndPr/>
     <w:sdtContent>
       <w:p>
         <w:pPr>

</xml_diff>